<commit_message>
docs: add codex debug flow guidance
</commit_message>
<xml_diff>
--- a/word_templates/xa_PCDS_template.docx
+++ b/word_templates/xa_PCDS_template.docx
@@ -157,45 +157,38 @@
         </w:rPr>
       </w:pPr>
       <w:r>
-        <w:t xml:space="preserve">Hôm nay, tại UBND xã [Niêm Yết], tỉnh Ninh Bình. Hàng thừa kế của ông </w:t>
-      </w:r>
-      <w:r>
-        <w:rPr>
-          <w:b/>
-          <w:bCs/>
-        </w:rPr>
-        <w:t xml:space="preserve">[Tên 1] </w:t>
-      </w:r>
-      <w:r>
-        <w:rPr>
-          <w:bCs/>
-        </w:rPr>
-        <w:t>và bà</w:t>
-      </w:r>
-      <w:r>
-        <w:rPr>
-          <w:b/>
-          <w:bCs/>
-        </w:rPr>
-        <w:t xml:space="preserve"> </w:t>
-      </w:r>
-      <w:r>
-        <w:rPr>
-          <w:b/>
-          <w:lang w:val="pt-BR"/>
-        </w:rPr>
-        <w:t>[Tên 2]</w:t>
-      </w:r>
-      <w:r>
-        <w:rPr>
-          <w:b/>
-          <w:bCs/>
-        </w:rPr>
-        <w:t xml:space="preserve"> </w:t>
-      </w:r>
-      <w:r>
-        <w:t xml:space="preserve">gồm những người có tên sau đây: </w:t>
-      </w:r>
+        <w:t xml:space="preserve">Hôm nay, tại UBND xã [Niêm Yết], tỉnh Ninh Bình. Hàng thừa kế của [Xưng hô 1] [Tên 1] và [Xưng hô 2] [Tên 2] gồm những người có tên sau đây: </w:t>
+      </w:r>
+      <w:r>
+        <w:rPr>
+          <w:b/>
+          <w:bCs/>
+        </w:rPr>
+      </w:r>
+      <w:r>
+        <w:rPr>
+          <w:bCs/>
+        </w:rPr>
+      </w:r>
+      <w:r>
+        <w:rPr>
+          <w:b/>
+          <w:bCs/>
+        </w:rPr>
+      </w:r>
+      <w:r>
+        <w:rPr>
+          <w:b/>
+          <w:lang w:val="pt-BR"/>
+        </w:rPr>
+      </w:r>
+      <w:r>
+        <w:rPr>
+          <w:b/>
+          <w:bCs/>
+        </w:rPr>
+      </w:r>
+      <w:r/>
     </w:p>
     <w:p>
       <w:pPr>
@@ -214,35 +207,120 @@
         <w:rPr>
           <w:lang w:val="pt-BR"/>
         </w:rPr>
-        <w:t xml:space="preserve">Ông/bà: </w:t>
-      </w:r>
-      <w:r>
-        <w:rPr>
-          <w:b/>
-          <w:lang w:val="pt-BR"/>
-        </w:rPr>
-        <w:t xml:space="preserve">[Tên </w:t>
-      </w:r>
-      <w:r>
-        <w:rPr>
-          <w:b/>
+        <w:t>[Xưng hô 1]: [Tên 1];</w:t>
+        <w:tab/>
+        <w:t>Sinh ngày: [Năm sinh 1];</w:t>
+      </w:r>
+      <w:r>
+        <w:rPr>
+          <w:b/>
+          <w:lang w:val="pt-BR"/>
+        </w:rPr>
+      </w:r>
+      <w:r>
+        <w:rPr>
+          <w:b/>
+          <w:lang w:val="pt-BR"/>
+        </w:rPr>
+      </w:r>
+      <w:r>
+        <w:rPr>
+          <w:b/>
+          <w:lang w:val="pt-BR"/>
+        </w:rPr>
+      </w:r>
+      <w:r>
+        <w:rPr>
+          <w:lang w:val="pt-BR"/>
+        </w:rPr>
+      </w:r>
+      <w:r>
+        <w:rPr>
+          <w:lang w:val="pt-BR"/>
+        </w:rPr>
+      </w:r>
+      <w:r>
+        <w:rPr>
+          <w:lang w:val="pt-BR"/>
+        </w:rPr>
+      </w:r>
+    </w:p>
+    <w:p>
+      <w:pPr>
+        <w:spacing w:before="60" w:line="330" w:lineRule="exact"/>
+        <w:ind w:left="567"/>
+        <w:rPr>
+          <w:lang w:val="pt-BR"/>
+        </w:rPr>
+      </w:pPr>
+      <w:r>
+        <w:rPr>
+          <w:lang w:val="pt-BR"/>
+        </w:rPr>
+        <w:t xml:space="preserve">[Loại CC </w:t>
+      </w:r>
+      <w:r>
+        <w:rPr>
           <w:lang w:val="pt-BR"/>
         </w:rPr>
         <w:t>1</w:t>
       </w:r>
       <w:r>
         <w:rPr>
-          <w:b/>
+          <w:lang w:val="pt-BR"/>
+        </w:rPr>
+        <w:t xml:space="preserve">] số: [CCCD </w:t>
+      </w:r>
+      <w:r>
+        <w:rPr>
+          <w:lang w:val="pt-BR"/>
+        </w:rPr>
+        <w:t>1</w:t>
+      </w:r>
+      <w:r>
+        <w:rPr>
+          <w:lang w:val="pt-BR"/>
+        </w:rPr>
+        <w:t xml:space="preserve">] do [Nơi cấp CC </w:t>
+      </w:r>
+      <w:r>
+        <w:rPr>
+          <w:lang w:val="pt-BR"/>
+        </w:rPr>
+        <w:t>1</w:t>
+      </w:r>
+      <w:r>
+        <w:rPr>
+          <w:lang w:val="pt-BR"/>
+        </w:rPr>
+        <w:t xml:space="preserve">] cấp ngày [Ngày cấp </w:t>
+      </w:r>
+      <w:r>
+        <w:rPr>
+          <w:lang w:val="pt-BR"/>
+        </w:rPr>
+        <w:t>1</w:t>
+      </w:r>
+      <w:r>
+        <w:rPr>
           <w:lang w:val="pt-BR"/>
         </w:rPr>
         <w:t>];</w:t>
       </w:r>
-      <w:r>
-        <w:rPr>
-          <w:lang w:val="pt-BR"/>
-        </w:rPr>
-        <w:tab/>
-        <w:t xml:space="preserve">Sinh ngày: [Năm sinh </w:t>
+    </w:p>
+    <w:p>
+      <w:pPr>
+        <w:spacing w:before="60" w:line="330" w:lineRule="exact"/>
+        <w:ind w:left="567"/>
+        <w:rPr>
+          <w:lang w:val="pt-BR"/>
+        </w:rPr>
+      </w:pPr>
+      <w:r>
+        <w:rPr>
+          <w:lang w:val="pt-BR"/>
+        </w:rPr>
+        <w:t xml:space="preserve">[Thường trú </w:t>
       </w:r>
       <w:r>
         <w:rPr>
@@ -254,7 +332,19 @@
         <w:rPr>
           <w:lang w:val="pt-BR"/>
         </w:rPr>
-        <w:t>];</w:t>
+        <w:t xml:space="preserve">]: [Địa chỉ </w:t>
+      </w:r>
+      <w:r>
+        <w:rPr>
+          <w:lang w:val="pt-BR"/>
+        </w:rPr>
+        <w:t>1</w:t>
+      </w:r>
+      <w:r>
+        <w:rPr>
+          <w:lang w:val="pt-BR"/>
+        </w:rPr>
+        <w:t>].</w:t>
       </w:r>
     </w:p>
     <w:p>
@@ -269,168 +359,57 @@
         <w:rPr>
           <w:lang w:val="pt-BR"/>
         </w:rPr>
-        <w:t xml:space="preserve">[Loại CC </w:t>
-      </w:r>
-      <w:r>
-        <w:rPr>
-          <w:lang w:val="pt-BR"/>
-        </w:rPr>
-        <w:t>1</w:t>
-      </w:r>
-      <w:r>
-        <w:rPr>
-          <w:lang w:val="pt-BR"/>
-        </w:rPr>
-        <w:t xml:space="preserve">] số: [CCCD </w:t>
-      </w:r>
-      <w:r>
-        <w:rPr>
-          <w:lang w:val="pt-BR"/>
-        </w:rPr>
-        <w:t>1</w:t>
-      </w:r>
-      <w:r>
-        <w:rPr>
-          <w:lang w:val="pt-BR"/>
-        </w:rPr>
-        <w:t xml:space="preserve">] do [Nơi cấp CC </w:t>
-      </w:r>
-      <w:r>
-        <w:rPr>
-          <w:lang w:val="pt-BR"/>
-        </w:rPr>
-        <w:t>1</w:t>
-      </w:r>
-      <w:r>
-        <w:rPr>
-          <w:lang w:val="pt-BR"/>
-        </w:rPr>
-        <w:t xml:space="preserve">] cấp ngày [Ngày cấp </w:t>
-      </w:r>
-      <w:r>
-        <w:rPr>
-          <w:lang w:val="pt-BR"/>
-        </w:rPr>
-        <w:t>1</w:t>
-      </w:r>
-      <w:r>
-        <w:rPr>
-          <w:lang w:val="pt-BR"/>
-        </w:rPr>
-        <w:t>];</w:t>
-      </w:r>
-    </w:p>
-    <w:p>
-      <w:pPr>
-        <w:spacing w:before="60" w:line="330" w:lineRule="exact"/>
-        <w:ind w:left="567"/>
-        <w:rPr>
-          <w:lang w:val="pt-BR"/>
-        </w:rPr>
-      </w:pPr>
-      <w:r>
-        <w:rPr>
-          <w:lang w:val="pt-BR"/>
-        </w:rPr>
-        <w:t xml:space="preserve">[Thường trú </w:t>
-      </w:r>
-      <w:r>
-        <w:rPr>
-          <w:lang w:val="pt-BR"/>
-        </w:rPr>
-        <w:t>1</w:t>
-      </w:r>
-      <w:r>
-        <w:rPr>
-          <w:lang w:val="pt-BR"/>
-        </w:rPr>
-        <w:t xml:space="preserve">]: [Địa chỉ </w:t>
-      </w:r>
-      <w:r>
-        <w:rPr>
-          <w:lang w:val="pt-BR"/>
-        </w:rPr>
-        <w:t>1</w:t>
-      </w:r>
-      <w:r>
-        <w:rPr>
-          <w:lang w:val="pt-BR"/>
-        </w:rPr>
-        <w:t>].</w:t>
-      </w:r>
-    </w:p>
-    <w:p>
-      <w:pPr>
-        <w:spacing w:before="60" w:line="330" w:lineRule="exact"/>
-        <w:ind w:left="567"/>
-        <w:rPr>
-          <w:lang w:val="pt-BR"/>
-        </w:rPr>
-      </w:pPr>
-      <w:r>
-        <w:rPr>
-          <w:lang w:val="pt-BR"/>
-        </w:rPr>
-        <w:t xml:space="preserve">Là </w:t>
+        <w:t xml:space="preserve">Là chồng [Xưng hô 2] [Tên 2]. </w:t>
       </w:r>
       <w:r>
         <w:rPr>
           <w:highlight w:val="yellow"/>
           <w:lang w:val="pt-BR"/>
         </w:rPr>
-        <w:t>chồng</w:t>
-      </w:r>
-      <w:r>
-        <w:rPr>
-          <w:lang w:val="pt-BR"/>
-        </w:rPr>
-        <w:t xml:space="preserve"> </w:t>
-      </w:r>
-      <w:r>
-        <w:rPr>
-          <w:lang w:val="pt-BR"/>
-        </w:rPr>
-        <w:t>bà</w:t>
-      </w:r>
-      <w:r>
-        <w:rPr>
-          <w:lang w:val="pt-BR"/>
-        </w:rPr>
-        <w:t xml:space="preserve"> </w:t>
-      </w:r>
-      <w:r>
-        <w:rPr>
-          <w:b/>
-          <w:bCs/>
-        </w:rPr>
-        <w:t xml:space="preserve">[Tên </w:t>
-      </w:r>
-      <w:r>
-        <w:rPr>
-          <w:b/>
-          <w:bCs/>
-        </w:rPr>
-        <w:t>2</w:t>
-      </w:r>
-      <w:r>
-        <w:rPr>
-          <w:b/>
-          <w:bCs/>
-        </w:rPr>
-        <w:t>]</w:t>
-      </w:r>
-      <w:r>
-        <w:rPr>
-          <w:b/>
-          <w:bCs/>
-        </w:rPr>
-        <w:t>.</w:t>
-      </w:r>
-      <w:r>
-        <w:rPr>
-          <w:lang w:val="pt-BR"/>
-        </w:rPr>
-        <w:t xml:space="preserve"> </w:t>
+      </w:r>
+      <w:r>
+        <w:rPr>
+          <w:lang w:val="pt-BR"/>
+        </w:rPr>
+      </w:r>
+      <w:r>
+        <w:rPr>
+          <w:lang w:val="pt-BR"/>
+        </w:rPr>
+      </w:r>
+      <w:r>
+        <w:rPr>
+          <w:lang w:val="pt-BR"/>
+        </w:rPr>
+      </w:r>
+      <w:r>
+        <w:rPr>
+          <w:b/>
+          <w:bCs/>
+        </w:rPr>
+      </w:r>
+      <w:r>
+        <w:rPr>
+          <w:b/>
+          <w:bCs/>
+        </w:rPr>
+      </w:r>
+      <w:r>
+        <w:rPr>
+          <w:b/>
+          <w:bCs/>
+        </w:rPr>
+      </w:r>
+      <w:r>
+        <w:rPr>
+          <w:b/>
+          <w:bCs/>
+        </w:rPr>
+      </w:r>
+      <w:r>
+        <w:rPr>
+          <w:lang w:val="pt-BR"/>
+        </w:rPr>
       </w:r>
     </w:p>
     <w:p>
@@ -449,22 +428,21 @@
         <w:rPr>
           <w:lang w:val="pt-BR"/>
         </w:rPr>
-        <w:t xml:space="preserve">Ông/bà: </w:t>
-      </w:r>
-      <w:r>
-        <w:rPr>
-          <w:b/>
-          <w:lang w:val="pt-BR"/>
-        </w:rPr>
-        <w:t>[Tên 2];</w:t>
-      </w:r>
-      <w:r>
-        <w:rPr>
-          <w:lang w:val="pt-BR"/>
-        </w:rPr>
+        <w:t>[Xưng hô 2]: [Tên 2];</w:t>
         <w:tab/>
         <w:t>Sinh ngày: [Năm sinh 2];</w:t>
       </w:r>
+      <w:r>
+        <w:rPr>
+          <w:b/>
+          <w:lang w:val="pt-BR"/>
+        </w:rPr>
+      </w:r>
+      <w:r>
+        <w:rPr>
+          <w:lang w:val="pt-BR"/>
+        </w:rPr>
+      </w:r>
     </w:p>
     <w:p>
       <w:pPr>
@@ -508,34 +486,30 @@
         <w:rPr>
           <w:lang w:val="pt-BR"/>
         </w:rPr>
-        <w:t xml:space="preserve">Là </w:t>
+        <w:t>Là vợ [Xưng hô 1] [Tên 1].</w:t>
       </w:r>
       <w:r>
         <w:rPr>
           <w:highlight w:val="yellow"/>
           <w:lang w:val="pt-BR"/>
         </w:rPr>
-        <w:t>vợ</w:t>
-      </w:r>
-      <w:r>
-        <w:rPr>
-          <w:lang w:val="pt-BR"/>
-        </w:rPr>
-        <w:t xml:space="preserve"> ông </w:t>
-      </w:r>
-      <w:r>
-        <w:rPr>
-          <w:b/>
-          <w:bCs/>
-        </w:rPr>
-        <w:t>[Tên 1]</w:t>
-      </w:r>
-      <w:r>
-        <w:rPr>
-          <w:b/>
-          <w:bCs/>
-        </w:rPr>
-        <w:t>.</w:t>
+      </w:r>
+      <w:r>
+        <w:rPr>
+          <w:lang w:val="pt-BR"/>
+        </w:rPr>
+      </w:r>
+      <w:r>
+        <w:rPr>
+          <w:b/>
+          <w:bCs/>
+        </w:rPr>
+      </w:r>
+      <w:r>
+        <w:rPr>
+          <w:b/>
+          <w:bCs/>
+        </w:rPr>
       </w:r>
     </w:p>
     <w:p>
@@ -554,22 +528,21 @@
         <w:rPr>
           <w:lang w:val="pt-BR"/>
         </w:rPr>
-        <w:t xml:space="preserve">Ông/bà: </w:t>
-      </w:r>
-      <w:r>
-        <w:rPr>
-          <w:b/>
-          <w:lang w:val="pt-BR"/>
-        </w:rPr>
-        <w:t>[Tên 3];</w:t>
-      </w:r>
-      <w:r>
-        <w:rPr>
-          <w:lang w:val="pt-BR"/>
-        </w:rPr>
+        <w:t>[Xưng hô 3]: [Tên 3];</w:t>
         <w:tab/>
         <w:t>Sinh ngày: [Năm sinh 3];</w:t>
       </w:r>
+      <w:r>
+        <w:rPr>
+          <w:b/>
+          <w:lang w:val="pt-BR"/>
+        </w:rPr>
+      </w:r>
+      <w:r>
+        <w:rPr>
+          <w:lang w:val="pt-BR"/>
+        </w:rPr>
+      </w:r>
     </w:p>
     <w:p>
       <w:pPr>
@@ -613,47 +586,41 @@
         <w:rPr>
           <w:lang w:val="pt-BR"/>
         </w:rPr>
-        <w:t xml:space="preserve">Là con đẻ ông </w:t>
-      </w:r>
-      <w:r>
-        <w:rPr>
-          <w:b/>
-          <w:bCs/>
-        </w:rPr>
-        <w:t>[Tên 1]</w:t>
-      </w:r>
-      <w:r>
-        <w:rPr>
-          <w:bCs/>
-        </w:rPr>
-        <w:t xml:space="preserve"> </w:t>
-      </w:r>
-      <w:r>
-        <w:rPr>
-          <w:bCs/>
-        </w:rPr>
-        <w:t>và bà</w:t>
-      </w:r>
-      <w:r>
-        <w:rPr>
-          <w:b/>
-          <w:bCs/>
-        </w:rPr>
-        <w:t xml:space="preserve"> </w:t>
-      </w:r>
-      <w:r>
-        <w:rPr>
-          <w:b/>
-          <w:lang w:val="pt-BR"/>
-        </w:rPr>
-        <w:t>[Tên 2]</w:t>
-      </w:r>
-      <w:r>
-        <w:rPr>
-          <w:b/>
-          <w:lang w:val="pt-BR"/>
-        </w:rPr>
-        <w:t>.</w:t>
+        <w:t>Là con đẻ [Xưng hô 1] [Tên 1] và [Xưng hô 2] [Tên 2].</w:t>
+      </w:r>
+      <w:r>
+        <w:rPr>
+          <w:b/>
+          <w:bCs/>
+        </w:rPr>
+      </w:r>
+      <w:r>
+        <w:rPr>
+          <w:bCs/>
+        </w:rPr>
+      </w:r>
+      <w:r>
+        <w:rPr>
+          <w:bCs/>
+        </w:rPr>
+      </w:r>
+      <w:r>
+        <w:rPr>
+          <w:b/>
+          <w:bCs/>
+        </w:rPr>
+      </w:r>
+      <w:r>
+        <w:rPr>
+          <w:b/>
+          <w:lang w:val="pt-BR"/>
+        </w:rPr>
+      </w:r>
+      <w:r>
+        <w:rPr>
+          <w:b/>
+          <w:lang w:val="pt-BR"/>
+        </w:rPr>
       </w:r>
     </w:p>
     <w:p>
@@ -672,22 +639,21 @@
         <w:rPr>
           <w:lang w:val="pt-BR"/>
         </w:rPr>
-        <w:t xml:space="preserve">Ông/bà: </w:t>
-      </w:r>
-      <w:r>
-        <w:rPr>
-          <w:b/>
-          <w:lang w:val="pt-BR"/>
-        </w:rPr>
-        <w:t>[Tên 4];</w:t>
-      </w:r>
-      <w:r>
-        <w:rPr>
-          <w:lang w:val="pt-BR"/>
-        </w:rPr>
+        <w:t>[Xưng hô 4]: [Tên 4];</w:t>
         <w:tab/>
         <w:t>Sinh ngày: [Năm sinh 4];</w:t>
       </w:r>
+      <w:r>
+        <w:rPr>
+          <w:b/>
+          <w:lang w:val="pt-BR"/>
+        </w:rPr>
+      </w:r>
+      <w:r>
+        <w:rPr>
+          <w:lang w:val="pt-BR"/>
+        </w:rPr>
+      </w:r>
     </w:p>
     <w:p>
       <w:pPr>
@@ -731,48 +697,42 @@
         <w:rPr>
           <w:lang w:val="pt-BR"/>
         </w:rPr>
-        <w:t xml:space="preserve">Là con đẻ ông </w:t>
-      </w:r>
-      <w:r>
-        <w:rPr>
-          <w:b/>
-          <w:bCs/>
-        </w:rPr>
-        <w:t>[Tên 1]</w:t>
-      </w:r>
-      <w:r>
-        <w:rPr>
-          <w:b/>
-          <w:bCs/>
-        </w:rPr>
-        <w:t xml:space="preserve"> </w:t>
-      </w:r>
-      <w:r>
-        <w:rPr>
-          <w:bCs/>
-        </w:rPr>
-        <w:t>và bà</w:t>
-      </w:r>
-      <w:r>
-        <w:rPr>
-          <w:b/>
-          <w:bCs/>
-        </w:rPr>
-        <w:t xml:space="preserve"> </w:t>
-      </w:r>
-      <w:r>
-        <w:rPr>
-          <w:b/>
-          <w:lang w:val="pt-BR"/>
-        </w:rPr>
-        <w:t>[Tên 2]</w:t>
-      </w:r>
-      <w:r>
-        <w:rPr>
-          <w:b/>
-          <w:lang w:val="pt-BR"/>
-        </w:rPr>
-        <w:t>.</w:t>
+        <w:t>Là con đẻ [Xưng hô 1] [Tên 1] và [Xưng hô 2] [Tên 2].</w:t>
+      </w:r>
+      <w:r>
+        <w:rPr>
+          <w:b/>
+          <w:bCs/>
+        </w:rPr>
+      </w:r>
+      <w:r>
+        <w:rPr>
+          <w:b/>
+          <w:bCs/>
+        </w:rPr>
+      </w:r>
+      <w:r>
+        <w:rPr>
+          <w:bCs/>
+        </w:rPr>
+      </w:r>
+      <w:r>
+        <w:rPr>
+          <w:b/>
+          <w:bCs/>
+        </w:rPr>
+      </w:r>
+      <w:r>
+        <w:rPr>
+          <w:b/>
+          <w:lang w:val="pt-BR"/>
+        </w:rPr>
+      </w:r>
+      <w:r>
+        <w:rPr>
+          <w:b/>
+          <w:lang w:val="pt-BR"/>
+        </w:rPr>
       </w:r>
     </w:p>
     <w:p>
@@ -791,22 +751,21 @@
         <w:rPr>
           <w:lang w:val="pt-BR"/>
         </w:rPr>
-        <w:t xml:space="preserve">Ông/bà: </w:t>
-      </w:r>
-      <w:r>
-        <w:rPr>
-          <w:b/>
-          <w:lang w:val="pt-BR"/>
-        </w:rPr>
-        <w:t>[Tên 5];</w:t>
-      </w:r>
-      <w:r>
-        <w:rPr>
-          <w:lang w:val="pt-BR"/>
-        </w:rPr>
+        <w:t>[Xưng hô 5]: [Tên 5];</w:t>
         <w:tab/>
         <w:t>Sinh ngày: [Năm sinh 5];</w:t>
       </w:r>
+      <w:r>
+        <w:rPr>
+          <w:b/>
+          <w:lang w:val="pt-BR"/>
+        </w:rPr>
+      </w:r>
+      <w:r>
+        <w:rPr>
+          <w:lang w:val="pt-BR"/>
+        </w:rPr>
+      </w:r>
     </w:p>
     <w:p>
       <w:pPr>
@@ -850,48 +809,42 @@
         <w:rPr>
           <w:lang w:val="pt-BR"/>
         </w:rPr>
-        <w:t xml:space="preserve">Là con đẻ ông </w:t>
-      </w:r>
-      <w:r>
-        <w:rPr>
-          <w:b/>
-          <w:bCs/>
-        </w:rPr>
-        <w:t>[Tên 1]</w:t>
-      </w:r>
-      <w:r>
-        <w:rPr>
-          <w:b/>
-          <w:bCs/>
-        </w:rPr>
-        <w:t xml:space="preserve"> </w:t>
-      </w:r>
-      <w:r>
-        <w:rPr>
-          <w:bCs/>
-        </w:rPr>
-        <w:t>và bà</w:t>
-      </w:r>
-      <w:r>
-        <w:rPr>
-          <w:b/>
-          <w:bCs/>
-        </w:rPr>
-        <w:t xml:space="preserve"> </w:t>
-      </w:r>
-      <w:r>
-        <w:rPr>
-          <w:b/>
-          <w:lang w:val="pt-BR"/>
-        </w:rPr>
-        <w:t>[Tên 2]</w:t>
-      </w:r>
-      <w:r>
-        <w:rPr>
-          <w:b/>
-          <w:lang w:val="pt-BR"/>
-        </w:rPr>
-        <w:t>.</w:t>
+        <w:t>Là con đẻ [Xưng hô 1] [Tên 1] và [Xưng hô 2] [Tên 2].</w:t>
+      </w:r>
+      <w:r>
+        <w:rPr>
+          <w:b/>
+          <w:bCs/>
+        </w:rPr>
+      </w:r>
+      <w:r>
+        <w:rPr>
+          <w:b/>
+          <w:bCs/>
+        </w:rPr>
+      </w:r>
+      <w:r>
+        <w:rPr>
+          <w:bCs/>
+        </w:rPr>
+      </w:r>
+      <w:r>
+        <w:rPr>
+          <w:b/>
+          <w:bCs/>
+        </w:rPr>
+      </w:r>
+      <w:r>
+        <w:rPr>
+          <w:b/>
+          <w:lang w:val="pt-BR"/>
+        </w:rPr>
+      </w:r>
+      <w:r>
+        <w:rPr>
+          <w:b/>
+          <w:lang w:val="pt-BR"/>
+        </w:rPr>
       </w:r>
     </w:p>
     <w:p>
@@ -910,22 +863,21 @@
         <w:rPr>
           <w:lang w:val="pt-BR"/>
         </w:rPr>
-        <w:t xml:space="preserve">Ông/bà: </w:t>
-      </w:r>
-      <w:r>
-        <w:rPr>
-          <w:b/>
-          <w:lang w:val="pt-BR"/>
-        </w:rPr>
-        <w:t>[Tên 6];</w:t>
-      </w:r>
-      <w:r>
-        <w:rPr>
-          <w:lang w:val="pt-BR"/>
-        </w:rPr>
+        <w:t>[Xưng hô 6]: [Tên 6];</w:t>
         <w:tab/>
         <w:t>Sinh ngày: [Năm sinh 6];</w:t>
       </w:r>
+      <w:r>
+        <w:rPr>
+          <w:b/>
+          <w:lang w:val="pt-BR"/>
+        </w:rPr>
+      </w:r>
+      <w:r>
+        <w:rPr>
+          <w:lang w:val="pt-BR"/>
+        </w:rPr>
+      </w:r>
     </w:p>
     <w:p>
       <w:pPr>
@@ -970,48 +922,42 @@
         <w:rPr>
           <w:lang w:val="pt-BR"/>
         </w:rPr>
-        <w:t xml:space="preserve">Là con đẻ ông </w:t>
-      </w:r>
-      <w:r>
-        <w:rPr>
-          <w:b/>
-          <w:bCs/>
-        </w:rPr>
-        <w:t>[Tên 1]</w:t>
-      </w:r>
-      <w:r>
-        <w:rPr>
-          <w:b/>
-          <w:bCs/>
-        </w:rPr>
-        <w:t xml:space="preserve"> </w:t>
-      </w:r>
-      <w:r>
-        <w:rPr>
-          <w:bCs/>
-        </w:rPr>
-        <w:t>và bà</w:t>
-      </w:r>
-      <w:r>
-        <w:rPr>
-          <w:b/>
-          <w:bCs/>
-        </w:rPr>
-        <w:t xml:space="preserve"> </w:t>
-      </w:r>
-      <w:r>
-        <w:rPr>
-          <w:b/>
-          <w:lang w:val="pt-BR"/>
-        </w:rPr>
-        <w:t>[Tên 2]</w:t>
-      </w:r>
-      <w:r>
-        <w:rPr>
-          <w:b/>
-          <w:lang w:val="pt-BR"/>
-        </w:rPr>
-        <w:t>.</w:t>
+        <w:t>Là con đẻ [Xưng hô 1] [Tên 1] và [Xưng hô 2] [Tên 2].</w:t>
+      </w:r>
+      <w:r>
+        <w:rPr>
+          <w:b/>
+          <w:bCs/>
+        </w:rPr>
+      </w:r>
+      <w:r>
+        <w:rPr>
+          <w:b/>
+          <w:bCs/>
+        </w:rPr>
+      </w:r>
+      <w:r>
+        <w:rPr>
+          <w:bCs/>
+        </w:rPr>
+      </w:r>
+      <w:r>
+        <w:rPr>
+          <w:b/>
+          <w:bCs/>
+        </w:rPr>
+      </w:r>
+      <w:r>
+        <w:rPr>
+          <w:b/>
+          <w:lang w:val="pt-BR"/>
+        </w:rPr>
+      </w:r>
+      <w:r>
+        <w:rPr>
+          <w:b/>
+          <w:lang w:val="pt-BR"/>
+        </w:rPr>
       </w:r>
     </w:p>
     <w:p>
@@ -1030,22 +976,21 @@
         <w:rPr>
           <w:lang w:val="pt-BR"/>
         </w:rPr>
-        <w:t xml:space="preserve">Ông/bà: </w:t>
-      </w:r>
-      <w:r>
-        <w:rPr>
-          <w:b/>
-          <w:lang w:val="pt-BR"/>
-        </w:rPr>
-        <w:t>[Tên 7];</w:t>
-      </w:r>
-      <w:r>
-        <w:rPr>
-          <w:lang w:val="pt-BR"/>
-        </w:rPr>
+        <w:t>[Xưng hô 7]: [Tên 7];</w:t>
         <w:tab/>
         <w:t>Sinh ngày: [Năm sinh 7];</w:t>
       </w:r>
+      <w:r>
+        <w:rPr>
+          <w:b/>
+          <w:lang w:val="pt-BR"/>
+        </w:rPr>
+      </w:r>
+      <w:r>
+        <w:rPr>
+          <w:lang w:val="pt-BR"/>
+        </w:rPr>
+      </w:r>
     </w:p>
     <w:p>
       <w:pPr>
@@ -1089,48 +1034,42 @@
         <w:rPr>
           <w:lang w:val="pt-BR"/>
         </w:rPr>
-        <w:t xml:space="preserve">Là con đẻ ông </w:t>
-      </w:r>
-      <w:r>
-        <w:rPr>
-          <w:b/>
-          <w:bCs/>
-        </w:rPr>
-        <w:t>[Tên 1]</w:t>
-      </w:r>
-      <w:r>
-        <w:rPr>
-          <w:b/>
-          <w:bCs/>
-        </w:rPr>
-        <w:t xml:space="preserve"> </w:t>
-      </w:r>
-      <w:r>
-        <w:rPr>
-          <w:bCs/>
-        </w:rPr>
-        <w:t>và bà</w:t>
-      </w:r>
-      <w:r>
-        <w:rPr>
-          <w:b/>
-          <w:bCs/>
-        </w:rPr>
-        <w:t xml:space="preserve"> </w:t>
-      </w:r>
-      <w:r>
-        <w:rPr>
-          <w:b/>
-          <w:lang w:val="pt-BR"/>
-        </w:rPr>
-        <w:t>[Tên 2]</w:t>
-      </w:r>
-      <w:r>
-        <w:rPr>
-          <w:b/>
-          <w:lang w:val="pt-BR"/>
-        </w:rPr>
-        <w:t>.</w:t>
+        <w:t>Là con đẻ [Xưng hô 1] [Tên 1] và [Xưng hô 2] [Tên 2].</w:t>
+      </w:r>
+      <w:r>
+        <w:rPr>
+          <w:b/>
+          <w:bCs/>
+        </w:rPr>
+      </w:r>
+      <w:r>
+        <w:rPr>
+          <w:b/>
+          <w:bCs/>
+        </w:rPr>
+      </w:r>
+      <w:r>
+        <w:rPr>
+          <w:bCs/>
+        </w:rPr>
+      </w:r>
+      <w:r>
+        <w:rPr>
+          <w:b/>
+          <w:bCs/>
+        </w:rPr>
+      </w:r>
+      <w:r>
+        <w:rPr>
+          <w:b/>
+          <w:lang w:val="pt-BR"/>
+        </w:rPr>
+      </w:r>
+      <w:r>
+        <w:rPr>
+          <w:b/>
+          <w:lang w:val="pt-BR"/>
+        </w:rPr>
       </w:r>
     </w:p>
     <w:p>
@@ -1149,22 +1088,21 @@
         <w:rPr>
           <w:lang w:val="pt-BR"/>
         </w:rPr>
-        <w:t xml:space="preserve">Ông/bà: </w:t>
-      </w:r>
-      <w:r>
-        <w:rPr>
-          <w:b/>
-          <w:lang w:val="pt-BR"/>
-        </w:rPr>
-        <w:t>[Tên 8];</w:t>
-      </w:r>
-      <w:r>
-        <w:rPr>
-          <w:lang w:val="pt-BR"/>
-        </w:rPr>
+        <w:t>[Xưng hô 8]: [Tên 8];</w:t>
         <w:tab/>
         <w:t>Sinh ngày: [Năm sinh 8];</w:t>
       </w:r>
+      <w:r>
+        <w:rPr>
+          <w:b/>
+          <w:lang w:val="pt-BR"/>
+        </w:rPr>
+      </w:r>
+      <w:r>
+        <w:rPr>
+          <w:lang w:val="pt-BR"/>
+        </w:rPr>
+      </w:r>
     </w:p>
     <w:p>
       <w:pPr>
@@ -1209,48 +1147,42 @@
         <w:rPr>
           <w:lang w:val="pt-BR"/>
         </w:rPr>
-        <w:t xml:space="preserve">Là con đẻ ông </w:t>
-      </w:r>
-      <w:r>
-        <w:rPr>
-          <w:b/>
-          <w:bCs/>
-        </w:rPr>
-        <w:t>[Tên 1]</w:t>
-      </w:r>
-      <w:r>
-        <w:rPr>
-          <w:b/>
-          <w:bCs/>
-        </w:rPr>
-        <w:t xml:space="preserve"> </w:t>
-      </w:r>
-      <w:r>
-        <w:rPr>
-          <w:bCs/>
-        </w:rPr>
-        <w:t>và bà</w:t>
-      </w:r>
-      <w:r>
-        <w:rPr>
-          <w:b/>
-          <w:bCs/>
-        </w:rPr>
-        <w:t xml:space="preserve"> </w:t>
-      </w:r>
-      <w:r>
-        <w:rPr>
-          <w:b/>
-          <w:lang w:val="pt-BR"/>
-        </w:rPr>
-        <w:t>[Tên 2]</w:t>
-      </w:r>
-      <w:r>
-        <w:rPr>
-          <w:b/>
-          <w:lang w:val="pt-BR"/>
-        </w:rPr>
-        <w:t>.</w:t>
+        <w:t>Là con đẻ [Xưng hô 1] [Tên 1] và [Xưng hô 2] [Tên 2].</w:t>
+      </w:r>
+      <w:r>
+        <w:rPr>
+          <w:b/>
+          <w:bCs/>
+        </w:rPr>
+      </w:r>
+      <w:r>
+        <w:rPr>
+          <w:b/>
+          <w:bCs/>
+        </w:rPr>
+      </w:r>
+      <w:r>
+        <w:rPr>
+          <w:bCs/>
+        </w:rPr>
+      </w:r>
+      <w:r>
+        <w:rPr>
+          <w:b/>
+          <w:bCs/>
+        </w:rPr>
+      </w:r>
+      <w:r>
+        <w:rPr>
+          <w:b/>
+          <w:lang w:val="pt-BR"/>
+        </w:rPr>
+      </w:r>
+      <w:r>
+        <w:rPr>
+          <w:b/>
+          <w:lang w:val="pt-BR"/>
+        </w:rPr>
       </w:r>
     </w:p>
     <w:p>
@@ -1269,22 +1201,21 @@
         <w:rPr>
           <w:lang w:val="pt-BR"/>
         </w:rPr>
-        <w:t xml:space="preserve">Ông/bà: </w:t>
-      </w:r>
-      <w:r>
-        <w:rPr>
-          <w:b/>
-          <w:lang w:val="pt-BR"/>
-        </w:rPr>
-        <w:t>[Tên 9];</w:t>
-      </w:r>
-      <w:r>
-        <w:rPr>
-          <w:lang w:val="pt-BR"/>
-        </w:rPr>
+        <w:t>[Xưng hô 9]: [Tên 9];</w:t>
         <w:tab/>
         <w:t>Sinh ngày: [Năm sinh 9];</w:t>
       </w:r>
+      <w:r>
+        <w:rPr>
+          <w:b/>
+          <w:lang w:val="pt-BR"/>
+        </w:rPr>
+      </w:r>
+      <w:r>
+        <w:rPr>
+          <w:lang w:val="pt-BR"/>
+        </w:rPr>
+      </w:r>
     </w:p>
     <w:p>
       <w:pPr>
@@ -1328,48 +1259,42 @@
         <w:rPr>
           <w:lang w:val="pt-BR"/>
         </w:rPr>
-        <w:t xml:space="preserve">Là con đẻ ông </w:t>
-      </w:r>
-      <w:r>
-        <w:rPr>
-          <w:b/>
-          <w:bCs/>
-        </w:rPr>
-        <w:t>[Tên 1]</w:t>
-      </w:r>
-      <w:r>
-        <w:rPr>
-          <w:b/>
-          <w:bCs/>
-        </w:rPr>
-        <w:t xml:space="preserve"> </w:t>
-      </w:r>
-      <w:r>
-        <w:rPr>
-          <w:bCs/>
-        </w:rPr>
-        <w:t>và bà</w:t>
-      </w:r>
-      <w:r>
-        <w:rPr>
-          <w:b/>
-          <w:bCs/>
-        </w:rPr>
-        <w:t xml:space="preserve"> </w:t>
-      </w:r>
-      <w:r>
-        <w:rPr>
-          <w:b/>
-          <w:lang w:val="pt-BR"/>
-        </w:rPr>
-        <w:t>[Tên 2]</w:t>
-      </w:r>
-      <w:r>
-        <w:rPr>
-          <w:b/>
-          <w:lang w:val="pt-BR"/>
-        </w:rPr>
-        <w:t>.</w:t>
+        <w:t>Là con đẻ [Xưng hô 1] [Tên 1] và [Xưng hô 2] [Tên 2].</w:t>
+      </w:r>
+      <w:r>
+        <w:rPr>
+          <w:b/>
+          <w:bCs/>
+        </w:rPr>
+      </w:r>
+      <w:r>
+        <w:rPr>
+          <w:b/>
+          <w:bCs/>
+        </w:rPr>
+      </w:r>
+      <w:r>
+        <w:rPr>
+          <w:bCs/>
+        </w:rPr>
+      </w:r>
+      <w:r>
+        <w:rPr>
+          <w:b/>
+          <w:bCs/>
+        </w:rPr>
+      </w:r>
+      <w:r>
+        <w:rPr>
+          <w:b/>
+          <w:lang w:val="pt-BR"/>
+        </w:rPr>
+      </w:r>
+      <w:r>
+        <w:rPr>
+          <w:b/>
+          <w:lang w:val="pt-BR"/>
+        </w:rPr>
       </w:r>
     </w:p>
     <w:p>
@@ -1388,22 +1313,21 @@
         <w:rPr>
           <w:lang w:val="pt-BR"/>
         </w:rPr>
-        <w:t xml:space="preserve">Ông/bà: </w:t>
-      </w:r>
-      <w:r>
-        <w:rPr>
-          <w:b/>
-          <w:lang w:val="pt-BR"/>
-        </w:rPr>
-        <w:t>[Tên 10];</w:t>
-      </w:r>
-      <w:r>
-        <w:rPr>
-          <w:lang w:val="pt-BR"/>
-        </w:rPr>
+        <w:t>[Xưng hô 10]: [Tên 10];</w:t>
         <w:tab/>
         <w:t>Sinh ngày: [Năm sinh 10];</w:t>
       </w:r>
+      <w:r>
+        <w:rPr>
+          <w:b/>
+          <w:lang w:val="pt-BR"/>
+        </w:rPr>
+      </w:r>
+      <w:r>
+        <w:rPr>
+          <w:lang w:val="pt-BR"/>
+        </w:rPr>
+      </w:r>
     </w:p>
     <w:p>
       <w:pPr>
@@ -1447,48 +1371,42 @@
         <w:rPr>
           <w:lang w:val="pt-BR"/>
         </w:rPr>
-        <w:t xml:space="preserve">Là con đẻ ông </w:t>
-      </w:r>
-      <w:r>
-        <w:rPr>
-          <w:b/>
-          <w:bCs/>
-        </w:rPr>
-        <w:t>[Tên 1]</w:t>
-      </w:r>
-      <w:r>
-        <w:rPr>
-          <w:b/>
-          <w:bCs/>
-        </w:rPr>
-        <w:t xml:space="preserve"> </w:t>
-      </w:r>
-      <w:r>
-        <w:rPr>
-          <w:bCs/>
-        </w:rPr>
-        <w:t>và bà</w:t>
-      </w:r>
-      <w:r>
-        <w:rPr>
-          <w:b/>
-          <w:bCs/>
-        </w:rPr>
-        <w:t xml:space="preserve"> </w:t>
-      </w:r>
-      <w:r>
-        <w:rPr>
-          <w:b/>
-          <w:lang w:val="pt-BR"/>
-        </w:rPr>
-        <w:t>[Tên 2]</w:t>
-      </w:r>
-      <w:r>
-        <w:rPr>
-          <w:b/>
-          <w:lang w:val="pt-BR"/>
-        </w:rPr>
-        <w:t>.</w:t>
+        <w:t>Là con đẻ [Xưng hô 1] [Tên 1] và [Xưng hô 2] [Tên 2].</w:t>
+      </w:r>
+      <w:r>
+        <w:rPr>
+          <w:b/>
+          <w:bCs/>
+        </w:rPr>
+      </w:r>
+      <w:r>
+        <w:rPr>
+          <w:b/>
+          <w:bCs/>
+        </w:rPr>
+      </w:r>
+      <w:r>
+        <w:rPr>
+          <w:bCs/>
+        </w:rPr>
+      </w:r>
+      <w:r>
+        <w:rPr>
+          <w:b/>
+          <w:bCs/>
+        </w:rPr>
+      </w:r>
+      <w:r>
+        <w:rPr>
+          <w:b/>
+          <w:lang w:val="pt-BR"/>
+        </w:rPr>
+      </w:r>
+      <w:r>
+        <w:rPr>
+          <w:b/>
+          <w:lang w:val="pt-BR"/>
+        </w:rPr>
       </w:r>
     </w:p>
     <w:bookmarkEnd w:id="0"/>
@@ -1506,56 +1424,48 @@
         <w:rPr>
           <w:lang w:val="pt-BR"/>
         </w:rPr>
-        <w:t xml:space="preserve">Ông </w:t>
-      </w:r>
-      <w:r>
-        <w:rPr>
-          <w:b/>
-          <w:lang w:val="pt-BR"/>
-        </w:rPr>
-        <w:t>[Tên 1]</w:t>
-      </w:r>
-      <w:r>
-        <w:rPr>
-          <w:lang w:val="pt-BR"/>
-        </w:rPr>
-        <w:t xml:space="preserve">; Sinh năm: [Năm sinh 1]; chết </w:t>
-      </w:r>
-      <w:r>
-        <w:rPr>
-          <w:lang w:val="pt-BR"/>
-        </w:rPr>
-        <w:t xml:space="preserve">ngày </w:t>
-      </w:r>
-      <w:r>
-        <w:rPr>
-          <w:bCs/>
-        </w:rPr>
-        <w:t>[Năm chết]</w:t>
-      </w:r>
-      <w:r>
-        <w:rPr>
-          <w:lang w:val="pt-BR"/>
-        </w:rPr>
-        <w:t xml:space="preserve"> theo Trích lục khai tử (Bản sao) số [CCCD 1] do Ủy ban nhân dân xã [Niêm Yết], tỉnh Ninh Bình ký ngày </w:t>
-      </w:r>
-      <w:r>
-        <w:rPr>
-          <w:bCs/>
-        </w:rPr>
-        <w:t>[Ngày cấp 1]</w:t>
-      </w:r>
-      <w:r>
-        <w:rPr>
-          <w:lang w:val="pt-BR"/>
-        </w:rPr>
-        <w:t>. Nơi thường trú cuối cùng trước khi chết: [Địa chỉ 1</w:t>
-      </w:r>
-      <w:r>
-        <w:rPr>
-          <w:lang w:val="pt-BR"/>
-        </w:rPr>
-        <w:t xml:space="preserve">]. </w:t>
+        <w:t xml:space="preserve">[Xưng hô 1] [Tên 1]; Sinh năm: [Năm sinh 1]; chết ngày [Năm chết 1] theo Trích lục khai tử (Bản sao) số [CCCD 1] do Ủy ban nhân dân xã [Niêm Yết], tỉnh Ninh Bình ký ngày [Ngày cấp 1]. Nơi thường trú cuối cùng trước khi chết: [Địa chỉ 1]. </w:t>
+      </w:r>
+      <w:r>
+        <w:rPr>
+          <w:b/>
+          <w:lang w:val="pt-BR"/>
+        </w:rPr>
+      </w:r>
+      <w:r>
+        <w:rPr>
+          <w:lang w:val="pt-BR"/>
+        </w:rPr>
+      </w:r>
+      <w:r>
+        <w:rPr>
+          <w:lang w:val="pt-BR"/>
+        </w:rPr>
+      </w:r>
+      <w:r>
+        <w:rPr>
+          <w:bCs/>
+        </w:rPr>
+      </w:r>
+      <w:r>
+        <w:rPr>
+          <w:lang w:val="pt-BR"/>
+        </w:rPr>
+      </w:r>
+      <w:r>
+        <w:rPr>
+          <w:bCs/>
+        </w:rPr>
+      </w:r>
+      <w:r>
+        <w:rPr>
+          <w:lang w:val="pt-BR"/>
+        </w:rPr>
+      </w:r>
+      <w:r>
+        <w:rPr>
+          <w:lang w:val="pt-BR"/>
+        </w:rPr>
       </w:r>
     </w:p>
     <w:p>
@@ -1572,50 +1482,43 @@
         <w:rPr>
           <w:lang w:val="pt-BR"/>
         </w:rPr>
-        <w:t xml:space="preserve">Bà </w:t>
-      </w:r>
-      <w:r>
-        <w:rPr>
-          <w:b/>
-          <w:lang w:val="pt-BR"/>
-        </w:rPr>
-        <w:t>[Tên 2]</w:t>
-      </w:r>
-      <w:r>
-        <w:rPr>
-          <w:lang w:val="pt-BR"/>
-        </w:rPr>
-        <w:t xml:space="preserve">; Sinh năm: [Năm sinh 2]; chết </w:t>
-      </w:r>
-      <w:r>
-        <w:rPr>
-          <w:lang w:val="pt-BR"/>
-        </w:rPr>
-        <w:t xml:space="preserve">ngày </w:t>
-      </w:r>
-      <w:r>
-        <w:rPr>
-          <w:bCs/>
-        </w:rPr>
-        <w:t xml:space="preserve">[Năm chết 2] </w:t>
-      </w:r>
-      <w:r>
-        <w:rPr>
-          <w:lang w:val="pt-BR"/>
-        </w:rPr>
-        <w:t xml:space="preserve">theo Trích lục khai tử (Bản sao) số [CCCD 2] do Ủy ban nhân dân xã [Niêm Yết], tỉnh Ninh Bình ký ngày </w:t>
-      </w:r>
-      <w:r>
-        <w:rPr>
-          <w:lang w:val="pt-BR"/>
-        </w:rPr>
-        <w:t>[Ngày cấp 2]</w:t>
-      </w:r>
-      <w:r>
-        <w:rPr>
-          <w:lang w:val="pt-BR"/>
-        </w:rPr>
-        <w:t>. Nơi thường trú cuối cùng trước khi chết: [Địa chỉ 2].</w:t>
+        <w:t>[Xưng hô 2] [Tên 2]; Sinh năm: [Năm sinh 2]; chết ngày [Năm chết 2] theo Trích lục khai tử (Bản sao) số [CCCD 2] do Ủy ban nhân dân xã [Niêm Yết], tỉnh Ninh Bình ký ngày [Ngày cấp 2]. Nơi thường trú cuối cùng trước khi chết: [Địa chỉ 2].</w:t>
+      </w:r>
+      <w:r>
+        <w:rPr>
+          <w:b/>
+          <w:lang w:val="pt-BR"/>
+        </w:rPr>
+      </w:r>
+      <w:r>
+        <w:rPr>
+          <w:lang w:val="pt-BR"/>
+        </w:rPr>
+      </w:r>
+      <w:r>
+        <w:rPr>
+          <w:lang w:val="pt-BR"/>
+        </w:rPr>
+      </w:r>
+      <w:r>
+        <w:rPr>
+          <w:bCs/>
+        </w:rPr>
+      </w:r>
+      <w:r>
+        <w:rPr>
+          <w:lang w:val="pt-BR"/>
+        </w:rPr>
+      </w:r>
+      <w:r>
+        <w:rPr>
+          <w:lang w:val="pt-BR"/>
+        </w:rPr>
+      </w:r>
+      <w:r>
+        <w:rPr>
+          <w:lang w:val="pt-BR"/>
+        </w:rPr>
       </w:r>
     </w:p>
     <w:p>
@@ -1625,41 +1528,33 @@
         <w:jc w:val="both"/>
       </w:pPr>
       <w:r>
-        <w:t xml:space="preserve">Trước khi chết </w:t>
-      </w:r>
-      <w:r>
-        <w:t xml:space="preserve">ông </w:t>
-      </w:r>
-      <w:r>
-        <w:rPr>
-          <w:b/>
-          <w:bCs/>
-        </w:rPr>
-        <w:t xml:space="preserve">[Tên 1] </w:t>
-      </w:r>
-      <w:r>
-        <w:rPr>
-          <w:bCs/>
-        </w:rPr>
-        <w:t>và bà</w:t>
-      </w:r>
-      <w:r>
-        <w:rPr>
-          <w:b/>
-          <w:bCs/>
-        </w:rPr>
-        <w:t xml:space="preserve"> </w:t>
-      </w:r>
-      <w:r>
-        <w:rPr>
-          <w:b/>
-          <w:lang w:val="pt-BR"/>
-        </w:rPr>
-        <w:t>[Tên 2]</w:t>
-      </w:r>
-      <w:r>
-        <w:t xml:space="preserve"> không để lại di chúc, không để lại bất kì nghĩa vụ tài sản nào mà người thừa kế phải thực hiện theo quy định của pháp luật. </w:t>
-      </w:r>
+        <w:t xml:space="preserve">Trước khi chết [Xưng hô 1] [Tên 1] và [Xưng hô 2] [Tên 2] không để lại di chúc, không để lại bất kì nghĩa vụ tài sản nào mà người thừa kế phải thực hiện theo quy định của pháp luật. </w:t>
+      </w:r>
+      <w:r/>
+      <w:r>
+        <w:rPr>
+          <w:b/>
+          <w:bCs/>
+        </w:rPr>
+      </w:r>
+      <w:r>
+        <w:rPr>
+          <w:bCs/>
+        </w:rPr>
+      </w:r>
+      <w:r>
+        <w:rPr>
+          <w:b/>
+          <w:bCs/>
+        </w:rPr>
+      </w:r>
+      <w:r>
+        <w:rPr>
+          <w:b/>
+          <w:lang w:val="pt-BR"/>
+        </w:rPr>
+      </w:r>
+      <w:r/>
     </w:p>
     <w:p>
       <w:pPr>
@@ -1674,13 +1569,12 @@
         <w:rPr>
           <w:highlight w:val="yellow"/>
         </w:rPr>
-        <w:t xml:space="preserve">Bố đẻ của </w:t>
+        <w:t>Bố đẻ của [Xưng hô 1] [Tên 1] và [Xưng hô 2] [Tên 2] đã chết từ lâu, chết trước khi [Xưng hô 1] [Tên 1] và [Xưng hô 2] [Tên 2] chết.</w:t>
       </w:r>
       <w:r>
         <w:rPr>
           <w:highlight w:val="yellow"/>
         </w:rPr>
-        <w:t xml:space="preserve">ông </w:t>
       </w:r>
       <w:r>
         <w:rPr>
@@ -1688,14 +1582,12 @@
           <w:bCs/>
           <w:highlight w:val="yellow"/>
         </w:rPr>
-        <w:t xml:space="preserve">[Tên 1] </w:t>
       </w:r>
       <w:r>
         <w:rPr>
           <w:bCs/>
           <w:highlight w:val="yellow"/>
         </w:rPr>
-        <w:t>và bà</w:t>
       </w:r>
       <w:r>
         <w:rPr>
@@ -1703,7 +1595,6 @@
           <w:bCs/>
           <w:highlight w:val="yellow"/>
         </w:rPr>
-        <w:t xml:space="preserve"> </w:t>
       </w:r>
       <w:r>
         <w:rPr>
@@ -1711,19 +1602,16 @@
           <w:highlight w:val="yellow"/>
           <w:lang w:val="pt-BR"/>
         </w:rPr>
-        <w:t>[Tên 2]</w:t>
       </w:r>
       <w:r>
         <w:rPr>
           <w:highlight w:val="yellow"/>
         </w:rPr>
-        <w:t xml:space="preserve"> đã chết từ lâu, chết trước khi </w:t>
       </w:r>
       <w:r>
         <w:rPr>
           <w:highlight w:val="yellow"/>
         </w:rPr>
-        <w:t xml:space="preserve">ông </w:t>
       </w:r>
       <w:r>
         <w:rPr>
@@ -1731,14 +1619,12 @@
           <w:bCs/>
           <w:highlight w:val="yellow"/>
         </w:rPr>
-        <w:t xml:space="preserve">[Tên 1] </w:t>
       </w:r>
       <w:r>
         <w:rPr>
           <w:bCs/>
           <w:highlight w:val="yellow"/>
         </w:rPr>
-        <w:t>và bà</w:t>
       </w:r>
       <w:r>
         <w:rPr>
@@ -1746,7 +1632,6 @@
           <w:bCs/>
           <w:highlight w:val="yellow"/>
         </w:rPr>
-        <w:t xml:space="preserve"> </w:t>
       </w:r>
       <w:r>
         <w:rPr>
@@ -1754,13 +1639,11 @@
           <w:highlight w:val="yellow"/>
           <w:lang w:val="pt-BR"/>
         </w:rPr>
-        <w:t>[Tên 2]</w:t>
       </w:r>
       <w:r>
         <w:rPr>
           <w:highlight w:val="yellow"/>
         </w:rPr>
-        <w:t xml:space="preserve"> chết.</w:t>
       </w:r>
     </w:p>
     <w:p>
@@ -1773,7 +1656,7 @@
         <w:rPr>
           <w:highlight w:val="yellow"/>
         </w:rPr>
-        <w:t xml:space="preserve">Mẹ đẻ của ông </w:t>
+        <w:t>Mẹ đẻ của [Xưng hô 1] [Tên 1] và [Xưng hô 2] [Tên 2] đã chết từ lâu, chết trước khi [Xưng hô 1] [Tên 1] và [Xưng hô 2] [Tên 2] chết.</w:t>
       </w:r>
       <w:r>
         <w:rPr>
@@ -1781,14 +1664,12 @@
           <w:bCs/>
           <w:highlight w:val="yellow"/>
         </w:rPr>
-        <w:t xml:space="preserve">[Tên 1] </w:t>
       </w:r>
       <w:r>
         <w:rPr>
           <w:bCs/>
           <w:highlight w:val="yellow"/>
         </w:rPr>
-        <w:t>và bà</w:t>
       </w:r>
       <w:r>
         <w:rPr>
@@ -1796,7 +1677,6 @@
           <w:bCs/>
           <w:highlight w:val="yellow"/>
         </w:rPr>
-        <w:t xml:space="preserve"> </w:t>
       </w:r>
       <w:r>
         <w:rPr>
@@ -1804,13 +1684,11 @@
           <w:highlight w:val="yellow"/>
           <w:lang w:val="pt-BR"/>
         </w:rPr>
-        <w:t>[Tên 2]</w:t>
       </w:r>
       <w:r>
         <w:rPr>
           <w:highlight w:val="yellow"/>
         </w:rPr>
-        <w:t xml:space="preserve"> đã chết từ lâu, chết trước khi ông </w:t>
       </w:r>
       <w:r>
         <w:rPr>
@@ -1818,14 +1696,12 @@
           <w:bCs/>
           <w:highlight w:val="yellow"/>
         </w:rPr>
-        <w:t xml:space="preserve">[Tên 1] </w:t>
       </w:r>
       <w:r>
         <w:rPr>
           <w:bCs/>
           <w:highlight w:val="yellow"/>
         </w:rPr>
-        <w:t>và bà</w:t>
       </w:r>
       <w:r>
         <w:rPr>
@@ -1833,7 +1709,6 @@
           <w:bCs/>
           <w:highlight w:val="yellow"/>
         </w:rPr>
-        <w:t xml:space="preserve"> </w:t>
       </w:r>
       <w:r>
         <w:rPr>
@@ -1841,13 +1716,11 @@
           <w:highlight w:val="yellow"/>
           <w:lang w:val="pt-BR"/>
         </w:rPr>
-        <w:t>[Tên 2]</w:t>
       </w:r>
       <w:r>
         <w:rPr>
           <w:highlight w:val="yellow"/>
         </w:rPr>
-        <w:t xml:space="preserve"> chết.</w:t>
       </w:r>
     </w:p>
     <w:p>
@@ -1860,65 +1733,47 @@
         </w:rPr>
       </w:pPr>
       <w:r>
-        <w:t xml:space="preserve">Ngoài ra </w:t>
-      </w:r>
-      <w:r>
-        <w:t xml:space="preserve">ông </w:t>
-      </w:r>
-      <w:r>
-        <w:rPr>
-          <w:b/>
-          <w:bCs/>
-        </w:rPr>
-        <w:t xml:space="preserve">[Tên 1] </w:t>
-      </w:r>
-      <w:r>
-        <w:rPr>
-          <w:bCs/>
-        </w:rPr>
-        <w:t>và bà</w:t>
-      </w:r>
-      <w:r>
-        <w:rPr>
-          <w:b/>
-          <w:bCs/>
-        </w:rPr>
-        <w:t xml:space="preserve"> </w:t>
-      </w:r>
-      <w:r>
-        <w:rPr>
-          <w:b/>
-          <w:lang w:val="pt-BR"/>
-        </w:rPr>
-        <w:t>[Tên 2]</w:t>
-      </w:r>
-      <w:r>
-        <w:t xml:space="preserve"> không </w:t>
-      </w:r>
+        <w:t>Ngoài ra [Xưng hô 1] [Tên 1] và [Xưng hô 2] [Tên 2] không có vợ, chồng, bố mẹ nuôi, con đẻ, con nuôi nào khác. Đến nay, UBND xã [Niêm Yết] không nhận được khiếu nại tố cáo nào.</w:t>
+      </w:r>
+      <w:r/>
+      <w:r>
+        <w:rPr>
+          <w:b/>
+          <w:bCs/>
+        </w:rPr>
+      </w:r>
+      <w:r>
+        <w:rPr>
+          <w:bCs/>
+        </w:rPr>
+      </w:r>
+      <w:r>
+        <w:rPr>
+          <w:b/>
+          <w:bCs/>
+        </w:rPr>
+      </w:r>
+      <w:r>
+        <w:rPr>
+          <w:b/>
+          <w:lang w:val="pt-BR"/>
+        </w:rPr>
+      </w:r>
+      <w:r/>
       <w:r>
         <w:rPr>
           <w:highlight w:val="yellow"/>
         </w:rPr>
-        <w:t xml:space="preserve">có </w:t>
       </w:r>
       <w:r>
         <w:rPr>
           <w:highlight w:val="yellow"/>
         </w:rPr>
-        <w:t>vợ, chồng,</w:t>
-      </w:r>
-      <w:r>
-        <w:t xml:space="preserve"> </w:t>
-      </w:r>
-      <w:r>
-        <w:t xml:space="preserve">bố mẹ nuôi, </w:t>
-      </w:r>
-      <w:r>
-        <w:t xml:space="preserve">con đẻ, </w:t>
-      </w:r>
-      <w:r>
-        <w:t>con nuôi nào khác. Đến nay, UBND xã [Niêm Yết] không nhận được khiếu nại tố cáo nào.</w:t>
-      </w:r>
+      </w:r>
+      <w:r/>
+      <w:r/>
+      <w:r/>
+      <w:r/>
     </w:p>
     <w:p>
       <w:pPr>
@@ -1930,41 +1785,33 @@
         </w:rPr>
       </w:pPr>
       <w:r>
-        <w:t xml:space="preserve">Chúng tôi là những người thừa kế theo pháp luật, thỏa thuận về việc phân chia di sản thừa kế của </w:t>
-      </w:r>
-      <w:r>
-        <w:t xml:space="preserve">ông </w:t>
-      </w:r>
-      <w:r>
-        <w:rPr>
-          <w:b/>
-          <w:bCs/>
-        </w:rPr>
-        <w:t xml:space="preserve">[Tên 1] </w:t>
-      </w:r>
-      <w:r>
-        <w:rPr>
-          <w:bCs/>
-        </w:rPr>
-        <w:t>và bà</w:t>
-      </w:r>
-      <w:r>
-        <w:rPr>
-          <w:b/>
-          <w:bCs/>
-        </w:rPr>
-        <w:t xml:space="preserve"> </w:t>
-      </w:r>
-      <w:r>
-        <w:rPr>
-          <w:b/>
-          <w:lang w:val="pt-BR"/>
-        </w:rPr>
-        <w:t>[Tên 2]</w:t>
-      </w:r>
-      <w:r>
-        <w:t xml:space="preserve"> đã mất để lại như sau:</w:t>
-      </w:r>
+        <w:t>Chúng tôi là những người thừa kế theo pháp luật, thỏa thuận về việc phân chia di sản thừa kế của [Xưng hô 1] [Tên 1] và [Xưng hô 2] [Tên 2] đã mất để lại như sau:</w:t>
+      </w:r>
+      <w:r/>
+      <w:r>
+        <w:rPr>
+          <w:b/>
+          <w:bCs/>
+        </w:rPr>
+      </w:r>
+      <w:r>
+        <w:rPr>
+          <w:bCs/>
+        </w:rPr>
+      </w:r>
+      <w:r>
+        <w:rPr>
+          <w:b/>
+          <w:bCs/>
+        </w:rPr>
+      </w:r>
+      <w:r>
+        <w:rPr>
+          <w:b/>
+          <w:lang w:val="pt-BR"/>
+        </w:rPr>
+      </w:r>
+      <w:r/>
     </w:p>
     <w:p>
       <w:pPr>
@@ -1976,48 +1823,39 @@
         </w:rPr>
       </w:pPr>
       <w:r>
-        <w:t xml:space="preserve">Di sản của </w:t>
-      </w:r>
-      <w:r>
-        <w:t xml:space="preserve">ông </w:t>
-      </w:r>
-      <w:r>
-        <w:rPr>
-          <w:b/>
-          <w:bCs/>
-        </w:rPr>
-        <w:t xml:space="preserve">[Tên 1] </w:t>
-      </w:r>
-      <w:r>
-        <w:rPr>
-          <w:bCs/>
-        </w:rPr>
-        <w:t>và bà</w:t>
-      </w:r>
-      <w:r>
-        <w:rPr>
-          <w:b/>
-          <w:bCs/>
-        </w:rPr>
-        <w:t xml:space="preserve"> </w:t>
-      </w:r>
-      <w:r>
-        <w:rPr>
-          <w:b/>
-          <w:lang w:val="pt-BR"/>
-        </w:rPr>
-        <w:t>[Tên 2]</w:t>
-      </w:r>
-      <w:r>
-        <w:rPr>
-          <w:b/>
-          <w:lang w:val="pt-BR"/>
-        </w:rPr>
-        <w:t xml:space="preserve"> </w:t>
-      </w:r>
-      <w:r>
-        <w:t xml:space="preserve">để lại: </w:t>
-      </w:r>
+        <w:t xml:space="preserve">Di sản của [Xưng hô 1] [Tên 1] và [Xưng hô 2] [Tên 2] để lại: </w:t>
+      </w:r>
+      <w:r/>
+      <w:r>
+        <w:rPr>
+          <w:b/>
+          <w:bCs/>
+        </w:rPr>
+      </w:r>
+      <w:r>
+        <w:rPr>
+          <w:bCs/>
+        </w:rPr>
+      </w:r>
+      <w:r>
+        <w:rPr>
+          <w:b/>
+          <w:bCs/>
+        </w:rPr>
+      </w:r>
+      <w:r>
+        <w:rPr>
+          <w:b/>
+          <w:lang w:val="pt-BR"/>
+        </w:rPr>
+      </w:r>
+      <w:r>
+        <w:rPr>
+          <w:b/>
+          <w:lang w:val="pt-BR"/>
+        </w:rPr>
+      </w:r>
+      <w:r/>
     </w:p>
     <w:p>
       <w:pPr>
@@ -2031,49 +1869,38 @@
         </w:rPr>
       </w:pPr>
       <w:r>
-        <w:t>Ô</w:t>
-      </w:r>
-      <w:r>
-        <w:t xml:space="preserve">ng </w:t>
-      </w:r>
-      <w:r>
-        <w:rPr>
-          <w:b/>
-          <w:bCs/>
-        </w:rPr>
-        <w:t xml:space="preserve">[Tên 1] </w:t>
-      </w:r>
-      <w:r>
-        <w:rPr>
-          <w:bCs/>
-        </w:rPr>
-        <w:t>và bà</w:t>
-      </w:r>
-      <w:r>
-        <w:rPr>
-          <w:b/>
-          <w:bCs/>
-        </w:rPr>
-        <w:t xml:space="preserve"> </w:t>
-      </w:r>
-      <w:r>
-        <w:rPr>
-          <w:b/>
-          <w:lang w:val="pt-BR"/>
-        </w:rPr>
-        <w:t>[Tên 2]</w:t>
-      </w:r>
-      <w:r>
-        <w:t xml:space="preserve"> có sử dụng </w:t>
-      </w:r>
-      <w:r>
-        <w:t xml:space="preserve">quyền sử dụng đất </w:t>
-      </w:r>
-      <w:r>
-        <w:rPr>
-          <w:lang w:val="pt-BR"/>
-        </w:rPr>
-        <w:t xml:space="preserve">có địa chỉ tại: </w:t>
+        <w:t>[Xưng hô 1] [Tên 1] và [Xưng hô 2] [Tên 2] có sử dụng quyền sử dụng đất có địa chỉ tại: [Địa chỉ đất] theo [Loại sổ] số: [Serial]; Số vào sổ cấp GCN: [Số vào sổ] do [Cơ quan cấp sổ] cấp ngày [Ngày cấp sổ], cụ thể như sau:</w:t>
+      </w:r>
+      <w:r/>
+      <w:r>
+        <w:rPr>
+          <w:b/>
+          <w:bCs/>
+        </w:rPr>
+      </w:r>
+      <w:r>
+        <w:rPr>
+          <w:bCs/>
+        </w:rPr>
+      </w:r>
+      <w:r>
+        <w:rPr>
+          <w:b/>
+          <w:bCs/>
+        </w:rPr>
+      </w:r>
+      <w:r>
+        <w:rPr>
+          <w:b/>
+          <w:lang w:val="pt-BR"/>
+        </w:rPr>
+      </w:r>
+      <w:r/>
+      <w:r/>
+      <w:r>
+        <w:rPr>
+          <w:lang w:val="pt-BR"/>
+        </w:rPr>
       </w:r>
       <w:r>
         <w:rPr>
@@ -2081,20 +1908,17 @@
           <w:noProof/>
           <w:color w:val="000000"/>
         </w:rPr>
-        <w:t>[Địa chỉ đất]</w:t>
       </w:r>
       <w:r>
         <w:rPr>
           <w:color w:val="000000"/>
         </w:rPr>
-        <w:t xml:space="preserve"> </w:t>
       </w:r>
       <w:r>
         <w:rPr>
           <w:color w:val="000000"/>
           <w:lang w:val="nl-NL"/>
         </w:rPr>
-        <w:t xml:space="preserve">theo </w:t>
       </w:r>
       <w:r>
         <w:rPr>
@@ -2102,7 +1926,6 @@
           <w:color w:val="000000"/>
           <w:lang w:val="nl-NL"/>
         </w:rPr>
-        <w:t>[Loại sổ]</w:t>
       </w:r>
       <w:r>
         <w:rPr>
@@ -2110,14 +1933,12 @@
           <w:color w:val="000000"/>
           <w:lang w:val="nl-NL"/>
         </w:rPr>
-        <w:t xml:space="preserve"> </w:t>
       </w:r>
       <w:r>
         <w:rPr>
           <w:color w:val="000000"/>
           <w:lang w:val="nl-NL"/>
         </w:rPr>
-        <w:t xml:space="preserve">số: </w:t>
       </w:r>
       <w:r>
         <w:rPr>
@@ -2126,14 +1947,12 @@
           <w:color w:val="000000"/>
           <w:lang w:val="nl-NL"/>
         </w:rPr>
-        <w:t>[Serial]</w:t>
       </w:r>
       <w:r>
         <w:rPr>
           <w:color w:val="000000"/>
           <w:lang w:val="nl-NL"/>
         </w:rPr>
-        <w:t xml:space="preserve">; Số vào sổ cấp GCN: </w:t>
       </w:r>
       <w:r>
         <w:rPr>
@@ -2142,14 +1961,12 @@
           <w:color w:val="000000"/>
           <w:lang w:val="nl-NL"/>
         </w:rPr>
-        <w:t>[Số vào sổ]</w:t>
       </w:r>
       <w:r>
         <w:rPr>
           <w:color w:val="000000"/>
           <w:lang w:val="nl-NL"/>
         </w:rPr>
-        <w:t xml:space="preserve"> do </w:t>
       </w:r>
       <w:r>
         <w:rPr>
@@ -2157,14 +1974,12 @@
           <w:color w:val="000000"/>
           <w:lang w:val="nl-NL"/>
         </w:rPr>
-        <w:t>[Cơ quan cấp sổ]</w:t>
       </w:r>
       <w:r>
         <w:rPr>
           <w:color w:val="000000"/>
           <w:lang w:val="nl-NL"/>
         </w:rPr>
-        <w:t xml:space="preserve"> cấp ngày </w:t>
       </w:r>
       <w:r>
         <w:rPr>
@@ -2173,14 +1988,12 @@
           <w:color w:val="000000"/>
           <w:lang w:val="nl-NL"/>
         </w:rPr>
-        <w:t>[Ngày cấp sổ]</w:t>
       </w:r>
       <w:r>
         <w:rPr>
           <w:color w:val="000000"/>
           <w:lang w:val="nl-NL"/>
         </w:rPr>
-        <w:t>, cụ thể như sau:</w:t>
       </w:r>
     </w:p>
     <w:p>
@@ -2450,15 +2263,10 @@
         <w:jc w:val="both"/>
       </w:pPr>
       <w:r>
-        <w:lastRenderedPageBreak/>
-        <w:t xml:space="preserve">Chúng tôi gồm: [Tên 2], [Tên 3], [Tên 4], [Tên 5], [Tên 6], [Tên 7], [Tên 8], [Tên 9], [Tên 10] là những người thừa kế theo pháp luật của ông </w:t>
-      </w:r>
-      <w:r>
-        <w:t>[Tên 1] và bà [Tên 2]</w:t>
-      </w:r>
-      <w:r>
-        <w:t>. Bằng văn bản này chúng tôi thống nhất phân chia như sau:</w:t>
-      </w:r>
+        <w:t>Chúng tôi gồm: [Tên 2], [Tên 3], [Tên 4], [Tên 5], [Tên 6], [Tên 7], [Tên 8], [Tên 9], [Tên 10] là những người thừa kế theo pháp luật của [Xưng hô 1] [Tên 1] và [Xưng hô 2] [Tên 2]. Bằng văn bản này chúng tôi thống nhất phân chia như sau:</w:t>
+      </w:r>
+      <w:r/>
+      <w:r/>
     </w:p>
     <w:p>
       <w:pPr>
@@ -2467,29 +2275,18 @@
         <w:jc w:val="both"/>
       </w:pPr>
       <w:r>
-        <w:t xml:space="preserve">Chúng tôi – [Tên 2], [Tên 4], [Tên 5], [Tên 6], [Tên 7], [Tên 8], [Tên 9], [Tên 10] tự nguyện tặng cho toàn bộ quyền hưởng di sản thừa kế của mình được thụ hưởng từ </w:t>
-      </w:r>
-      <w:r>
-        <w:t>ông [Tên 1] và bà [Tên 2]</w:t>
-      </w:r>
-      <w:r>
-        <w:t xml:space="preserve"> và tặng cho phần quyền sử dụng đất thuộc quyền sử dụng của chúng tôi </w:t>
-      </w:r>
-      <w:r>
-        <w:t xml:space="preserve">cho ông/bà [Tên 3] (có thông tin như nêu trên) - là con đẻ của </w:t>
-      </w:r>
-      <w:r>
-        <w:t>ông [Tên 1] và bà [Tên 2]</w:t>
-      </w:r>
-      <w:r>
-        <w:t xml:space="preserve"> được thừa kế sử dụng diện tích</w:t>
-      </w:r>
+        <w:t>Chúng tôi – [Tên 2], [Tên 4], [Tên 5], [Tên 6], [Tên 7], [Tên 8], [Tên 9], [Tên 10] tự nguyện tặng cho toàn bộ quyền hưởng di sản thừa kế của mình được thụ hưởng từ [Xưng hô 1] [Tên 1] và [Xưng hô 2] [Tên 2] và tặng cho phần quyền sử dụng đất thuộc quyền sử dụng của chúng tôi cho [Xưng hô 3] [Tên 3] (có thông tin như nêu trên) - là con đẻ của [Xưng hô 1] [Tên 1] và [Xưng hô 2] [Tên 2] được thừa kế sử dụng diện tích: [Diện tích] m2, trong đó: [Loại đất]; Thửa đất số: [Số thửa], tờ bản đồ số: [Số tờ] theo [Loại sổ] số: [Serial]; Số vào sổ cấp GCN: [Số vào sổ] do [Cơ quan cấp sổ] cấp ngày [Ngày cấp sổ], Thông tin cụ thể như nêu ở trên.</w:t>
+      </w:r>
+      <w:r/>
+      <w:r/>
+      <w:r/>
+      <w:r/>
+      <w:r/>
       <w:r>
         <w:rPr>
           <w:color w:val="000000"/>
           <w:lang w:val="nl-NL"/>
         </w:rPr>
-        <w:t xml:space="preserve">: </w:t>
       </w:r>
       <w:r>
         <w:rPr>
@@ -2497,42 +2294,34 @@
           <w:color w:val="000000"/>
           <w:lang w:val="nl-NL"/>
         </w:rPr>
-        <w:t>[Diện tích]</w:t>
       </w:r>
       <w:r>
         <w:rPr>
           <w:color w:val="000000"/>
           <w:lang w:val="nl-NL"/>
         </w:rPr>
-        <w:t xml:space="preserve"> m2</w:t>
-      </w:r>
-      <w:r>
-        <w:t xml:space="preserve">, trong đó: </w:t>
-      </w:r>
+      </w:r>
+      <w:r/>
       <w:r>
         <w:rPr>
           <w:color w:val="000000"/>
           <w:lang w:val="nl-NL"/>
         </w:rPr>
-        <w:t>[Loại đất]</w:t>
       </w:r>
       <w:r>
         <w:rPr>
           <w:lang w:val="nl-NL"/>
         </w:rPr>
-        <w:t>; Thửa đất số: [Số thửa], tờ bản đồ số: [Số tờ] theo [Loại sổ]</w:t>
       </w:r>
       <w:r>
         <w:rPr>
           <w:lang w:val="nl-NL"/>
         </w:rPr>
-        <w:t xml:space="preserve"> </w:t>
       </w:r>
       <w:r>
         <w:rPr>
           <w:lang w:val="nl-NL"/>
         </w:rPr>
-        <w:t>số: [Serial]; Số vào sổ cấp GCN: [Số vào sổ] do [Cơ quan cấp sổ] cấp ngày [Ngày cấp sổ], Thông tin cụ thể như nêu ở trên.</w:t>
       </w:r>
     </w:p>
     <w:p>
@@ -2542,29 +2331,18 @@
         <w:jc w:val="both"/>
       </w:pPr>
       <w:r>
-        <w:t xml:space="preserve">Ông/bà [Tên 3] đồng ý nhận phần di sản của </w:t>
-      </w:r>
-      <w:r>
-        <w:t>ông [Tên 1] và bà [Tên 2]</w:t>
-      </w:r>
-      <w:r>
-        <w:t xml:space="preserve"> để lại </w:t>
-      </w:r>
-      <w:r>
-        <w:t xml:space="preserve">và </w:t>
-      </w:r>
+        <w:t xml:space="preserve">[Xưng hô 3] [Tên 3] đồng ý nhận phần di sản của [Xưng hô 1] [Tên 1] và [Xưng hô 2] [Tên 2] để lại và phần quyền sử dụng đất được nhận tặng cho theo nội dung thỏa thuận phân chia di sản thửa kế ở trên. </w:t>
+      </w:r>
+      <w:r/>
+      <w:r/>
+      <w:r/>
       <w:r>
         <w:rPr>
           <w:highlight w:val="yellow"/>
         </w:rPr>
-        <w:t>phần quyền sử dụng đất được nhận tặng cho</w:t>
-      </w:r>
-      <w:r>
-        <w:t xml:space="preserve"> </w:t>
-      </w:r>
-      <w:r>
-        <w:t xml:space="preserve">theo nội dung thỏa thuận phân chia di sản thửa kế ở trên. </w:t>
-      </w:r>
+      </w:r>
+      <w:r/>
+      <w:r/>
     </w:p>
     <w:p>
       <w:pPr>
@@ -2598,14 +2376,10 @@
         <w:jc w:val="both"/>
       </w:pPr>
       <w:r>
-        <w:t xml:space="preserve">- Ngoài chúng tôi ra, </w:t>
-      </w:r>
-      <w:r>
-        <w:t>ông [Tên 1] và bà [Tên 2]</w:t>
-      </w:r>
-      <w:r>
-        <w:t xml:space="preserve"> không còn người thừa kế nào khác, nếu sau này phát sinh thừa kế chúng tôi hoàn toàn chịu trách nhiệm trước pháp luật, kể cả việc thanh toán bồi hoàn cho họ.</w:t>
-      </w:r>
+        <w:t>- Ngoài chúng tôi ra, [Xưng hô 1] [Tên 1] và [Xưng hô 2] [Tên 2] không còn người thừa kế nào khác, nếu sau này phát sinh thừa kế chúng tôi hoàn toàn chịu trách nhiệm trước pháp luật, kể cả việc thanh toán bồi hoàn cho họ.</w:t>
+      </w:r>
+      <w:r/>
+      <w:r/>
     </w:p>
     <w:p>
       <w:pPr>
@@ -3233,21 +3007,20 @@
         <w:rPr>
           <w:lang w:val="pt-BR"/>
         </w:rPr>
-        <w:t xml:space="preserve">Ông/bà: </w:t>
-      </w:r>
-      <w:r>
-        <w:rPr>
-          <w:b/>
-          <w:lang w:val="pt-BR"/>
-        </w:rPr>
-        <w:t>[Tên 2];</w:t>
-      </w:r>
-      <w:r>
-        <w:rPr>
-          <w:lang w:val="pt-BR"/>
-        </w:rPr>
+        <w:t>[Xưng hô 2]: [Tên 2];</w:t>
         <w:tab/>
         <w:t>Sinh ngày: [Năm sinh 2];</w:t>
+      </w:r>
+      <w:r>
+        <w:rPr>
+          <w:b/>
+          <w:lang w:val="pt-BR"/>
+        </w:rPr>
+      </w:r>
+      <w:r>
+        <w:rPr>
+          <w:lang w:val="pt-BR"/>
+        </w:rPr>
       </w:r>
     </w:p>
     <w:p>
@@ -3281,30 +3054,28 @@
         <w:rPr>
           <w:lang w:val="pt-BR"/>
         </w:rPr>
-        <w:t xml:space="preserve">Ông/bà: </w:t>
-      </w:r>
-      <w:bookmarkStart w:id="2" w:name="_Hlk221113460"/>
-      <w:r>
-        <w:rPr>
-          <w:b/>
-          <w:lang w:val="pt-BR"/>
-        </w:rPr>
-        <w:t>[Tên 3]</w:t>
-      </w:r>
-      <w:bookmarkEnd w:id="2"/>
-      <w:r>
-        <w:rPr>
-          <w:b/>
-          <w:lang w:val="pt-BR"/>
-        </w:rPr>
-        <w:t>;</w:t>
-      </w:r>
-      <w:r>
-        <w:rPr>
-          <w:lang w:val="pt-BR"/>
-        </w:rPr>
+        <w:t>[Xưng hô 3]: [Tên 3];</w:t>
         <w:tab/>
         <w:t>Sinh ngày: [Năm sinh 3];</w:t>
+      </w:r>
+      <w:bookmarkStart w:id="2" w:name="_Hlk221113460"/>
+      <w:r>
+        <w:rPr>
+          <w:b/>
+          <w:lang w:val="pt-BR"/>
+        </w:rPr>
+      </w:r>
+      <w:bookmarkEnd w:id="2"/>
+      <w:r>
+        <w:rPr>
+          <w:b/>
+          <w:lang w:val="pt-BR"/>
+        </w:rPr>
+      </w:r>
+      <w:r>
+        <w:rPr>
+          <w:lang w:val="pt-BR"/>
+        </w:rPr>
       </w:r>
     </w:p>
     <w:p>
@@ -3338,21 +3109,20 @@
         <w:rPr>
           <w:lang w:val="pt-BR"/>
         </w:rPr>
-        <w:t xml:space="preserve">Ông/bà: </w:t>
-      </w:r>
-      <w:r>
-        <w:rPr>
-          <w:b/>
-          <w:lang w:val="pt-BR"/>
-        </w:rPr>
-        <w:t>[Tên 4];</w:t>
-      </w:r>
-      <w:r>
-        <w:rPr>
-          <w:lang w:val="pt-BR"/>
-        </w:rPr>
+        <w:t>[Xưng hô 4]: [Tên 4];</w:t>
         <w:tab/>
         <w:t>Sinh ngày: [Năm sinh 4];</w:t>
+      </w:r>
+      <w:r>
+        <w:rPr>
+          <w:b/>
+          <w:lang w:val="pt-BR"/>
+        </w:rPr>
+      </w:r>
+      <w:r>
+        <w:rPr>
+          <w:lang w:val="pt-BR"/>
+        </w:rPr>
       </w:r>
     </w:p>
     <w:p>
@@ -3386,21 +3156,20 @@
         <w:rPr>
           <w:lang w:val="pt-BR"/>
         </w:rPr>
-        <w:t xml:space="preserve">Ông/bà: </w:t>
-      </w:r>
-      <w:r>
-        <w:rPr>
-          <w:b/>
-          <w:lang w:val="pt-BR"/>
-        </w:rPr>
-        <w:t>[Tên 5];</w:t>
-      </w:r>
-      <w:r>
-        <w:rPr>
-          <w:lang w:val="pt-BR"/>
-        </w:rPr>
+        <w:t>[Xưng hô 5]: [Tên 5];</w:t>
         <w:tab/>
         <w:t>Sinh ngày: [Năm sinh 5];</w:t>
+      </w:r>
+      <w:r>
+        <w:rPr>
+          <w:b/>
+          <w:lang w:val="pt-BR"/>
+        </w:rPr>
+      </w:r>
+      <w:r>
+        <w:rPr>
+          <w:lang w:val="pt-BR"/>
+        </w:rPr>
       </w:r>
     </w:p>
     <w:p>
@@ -3434,21 +3203,20 @@
         <w:rPr>
           <w:lang w:val="pt-BR"/>
         </w:rPr>
-        <w:t xml:space="preserve">Ông/bà: </w:t>
-      </w:r>
-      <w:r>
-        <w:rPr>
-          <w:b/>
-          <w:lang w:val="pt-BR"/>
-        </w:rPr>
-        <w:t>[Tên 6];</w:t>
-      </w:r>
-      <w:r>
-        <w:rPr>
-          <w:lang w:val="pt-BR"/>
-        </w:rPr>
+        <w:t>[Xưng hô 6]: [Tên 6];</w:t>
         <w:tab/>
         <w:t>Sinh ngày: [Năm sinh 6];</w:t>
+      </w:r>
+      <w:r>
+        <w:rPr>
+          <w:b/>
+          <w:lang w:val="pt-BR"/>
+        </w:rPr>
+      </w:r>
+      <w:r>
+        <w:rPr>
+          <w:lang w:val="pt-BR"/>
+        </w:rPr>
       </w:r>
     </w:p>
     <w:p>
@@ -3482,21 +3250,20 @@
         <w:rPr>
           <w:lang w:val="pt-BR"/>
         </w:rPr>
-        <w:t xml:space="preserve">Ông/bà: </w:t>
-      </w:r>
-      <w:r>
-        <w:rPr>
-          <w:b/>
-          <w:lang w:val="pt-BR"/>
-        </w:rPr>
-        <w:t>[Tên 7];</w:t>
-      </w:r>
-      <w:r>
-        <w:rPr>
-          <w:lang w:val="pt-BR"/>
-        </w:rPr>
+        <w:t>[Xưng hô 7]: [Tên 7];</w:t>
         <w:tab/>
         <w:t>Sinh ngày: [Năm sinh 7];</w:t>
+      </w:r>
+      <w:r>
+        <w:rPr>
+          <w:b/>
+          <w:lang w:val="pt-BR"/>
+        </w:rPr>
+      </w:r>
+      <w:r>
+        <w:rPr>
+          <w:lang w:val="pt-BR"/>
+        </w:rPr>
       </w:r>
     </w:p>
     <w:p>
@@ -3530,21 +3297,20 @@
         <w:rPr>
           <w:lang w:val="pt-BR"/>
         </w:rPr>
-        <w:t xml:space="preserve">Ông/bà: </w:t>
-      </w:r>
-      <w:r>
-        <w:rPr>
-          <w:b/>
-          <w:lang w:val="pt-BR"/>
-        </w:rPr>
-        <w:t>[Tên 8];</w:t>
-      </w:r>
-      <w:r>
-        <w:rPr>
-          <w:lang w:val="pt-BR"/>
-        </w:rPr>
+        <w:t>[Xưng hô 8]: [Tên 8];</w:t>
         <w:tab/>
         <w:t>Sinh ngày: [Năm sinh 8];</w:t>
+      </w:r>
+      <w:r>
+        <w:rPr>
+          <w:b/>
+          <w:lang w:val="pt-BR"/>
+        </w:rPr>
+      </w:r>
+      <w:r>
+        <w:rPr>
+          <w:lang w:val="pt-BR"/>
+        </w:rPr>
       </w:r>
     </w:p>
     <w:p>
@@ -3578,21 +3344,20 @@
         <w:rPr>
           <w:lang w:val="pt-BR"/>
         </w:rPr>
-        <w:t xml:space="preserve">Ông/bà: </w:t>
-      </w:r>
-      <w:r>
-        <w:rPr>
-          <w:b/>
-          <w:lang w:val="pt-BR"/>
-        </w:rPr>
-        <w:t>[Tên 9];</w:t>
-      </w:r>
-      <w:r>
-        <w:rPr>
-          <w:lang w:val="pt-BR"/>
-        </w:rPr>
+        <w:t>[Xưng hô 9]: [Tên 9];</w:t>
         <w:tab/>
         <w:t>Sinh ngày: [Năm sinh 9];</w:t>
+      </w:r>
+      <w:r>
+        <w:rPr>
+          <w:b/>
+          <w:lang w:val="pt-BR"/>
+        </w:rPr>
+      </w:r>
+      <w:r>
+        <w:rPr>
+          <w:lang w:val="pt-BR"/>
+        </w:rPr>
       </w:r>
     </w:p>
     <w:p>
@@ -3626,21 +3391,20 @@
         <w:rPr>
           <w:lang w:val="pt-BR"/>
         </w:rPr>
-        <w:t xml:space="preserve">Ông/bà: </w:t>
-      </w:r>
-      <w:r>
-        <w:rPr>
-          <w:b/>
-          <w:lang w:val="pt-BR"/>
-        </w:rPr>
-        <w:t>[Tên 10];</w:t>
-      </w:r>
-      <w:r>
-        <w:rPr>
-          <w:lang w:val="pt-BR"/>
-        </w:rPr>
+        <w:t>[Xưng hô 10]: [Tên 10];</w:t>
         <w:tab/>
         <w:t>Sinh ngày: [Năm sinh 10];</w:t>
+      </w:r>
+      <w:r>
+        <w:rPr>
+          <w:b/>
+          <w:lang w:val="pt-BR"/>
+        </w:rPr>
+      </w:r>
+      <w:r>
+        <w:rPr>
+          <w:lang w:val="pt-BR"/>
+        </w:rPr>
       </w:r>
     </w:p>
     <w:p>
@@ -4043,7 +3807,7 @@
               <w:spacing w:before="60" w:line="330" w:lineRule="exact"/>
             </w:pPr>
             <w:r>
-              <w:t>Bố đẻ ông [Tên 1]</w:t>
+              <w:t>Bố đẻ [Xưng hô 1] [Tên 1]</w:t>
             </w:r>
           </w:p>
         </w:tc>
@@ -4116,7 +3880,7 @@
               <w:spacing w:before="60" w:line="330" w:lineRule="exact"/>
             </w:pPr>
             <w:r>
-              <w:t>Mẹ đẻ ông [Tên 1]</w:t>
+              <w:t>Mẹ đẻ [Xưng hô 1] [Tên 1]</w:t>
             </w:r>
           </w:p>
         </w:tc>
@@ -5174,6 +4938,8 @@
       </w:pPr>
     </w:p>
     <w:sectPr>
+      <w:headerReference w:type="default" r:id="rId7"/>
+      <w:footerReference w:type="default" r:id="rId8"/>
       <w:pgSz w:w="11909" w:h="16834" w:code="9"/>
       <w:pgMar w:top="851" w:right="839" w:bottom="1135" w:left="1134" w:header="720" w:footer="720" w:gutter="0"/>
       <w:cols w:space="720"/>
@@ -5181,6 +4947,26 @@
     </w:sectPr>
   </w:body>
 </w:document>
+</file>
+
+<file path=word/footer1.xml><?xml version="1.0" encoding="utf-8"?>
+<w:ftr xmlns:m="http://schemas.openxmlformats.org/officeDocument/2006/math" xmlns:mc="http://schemas.openxmlformats.org/markup-compatibility/2006" xmlns:mo="http://schemas.microsoft.com/office/mac/office/2008/main" xmlns:mv="urn:schemas-microsoft-com:mac:vml" xmlns:o="urn:schemas-microsoft-com:office:office" xmlns:r="http://schemas.openxmlformats.org/officeDocument/2006/relationships" xmlns:v="urn:schemas-microsoft-com:vml" xmlns:w10="urn:schemas-microsoft-com:office:word" xmlns:w14="http://schemas.microsoft.com/office/word/2010/wordml" xmlns:w="http://schemas.openxmlformats.org/wordprocessingml/2006/main" xmlns:wne="http://schemas.microsoft.com/office/word/2006/wordml" xmlns:wp14="http://schemas.microsoft.com/office/word/2010/wordprocessingDrawing" xmlns:wp="http://schemas.openxmlformats.org/drawingml/2006/wordprocessingDrawing" xmlns:wpc="http://schemas.microsoft.com/office/word/2010/wordprocessingCanvas" xmlns:wpg="http://schemas.microsoft.com/office/word/2010/wordprocessingGroup" xmlns:wpi="http://schemas.microsoft.com/office/word/2010/wordprocessingInk" xmlns:wps="http://schemas.microsoft.com/office/word/2010/wordprocessingShape" mc:Ignorable="w14 wp14">
+  <w:p>
+    <w:pPr>
+      <w:pStyle w:val="Footer"/>
+    </w:pPr>
+  </w:p>
+</w:ftr>
+</file>
+
+<file path=word/header1.xml><?xml version="1.0" encoding="utf-8"?>
+<w:hdr xmlns:m="http://schemas.openxmlformats.org/officeDocument/2006/math" xmlns:mc="http://schemas.openxmlformats.org/markup-compatibility/2006" xmlns:mo="http://schemas.microsoft.com/office/mac/office/2008/main" xmlns:mv="urn:schemas-microsoft-com:mac:vml" xmlns:o="urn:schemas-microsoft-com:office:office" xmlns:r="http://schemas.openxmlformats.org/officeDocument/2006/relationships" xmlns:v="urn:schemas-microsoft-com:vml" xmlns:w10="urn:schemas-microsoft-com:office:word" xmlns:w14="http://schemas.microsoft.com/office/word/2010/wordml" xmlns:w="http://schemas.openxmlformats.org/wordprocessingml/2006/main" xmlns:wne="http://schemas.microsoft.com/office/word/2006/wordml" xmlns:wp14="http://schemas.microsoft.com/office/word/2010/wordprocessingDrawing" xmlns:wp="http://schemas.openxmlformats.org/drawingml/2006/wordprocessingDrawing" xmlns:wpc="http://schemas.microsoft.com/office/word/2010/wordprocessingCanvas" xmlns:wpg="http://schemas.microsoft.com/office/word/2010/wordprocessingGroup" xmlns:wpi="http://schemas.microsoft.com/office/word/2010/wordprocessingInk" xmlns:wps="http://schemas.microsoft.com/office/word/2010/wordprocessingShape" mc:Ignorable="w14 wp14">
+  <w:p>
+    <w:pPr>
+      <w:pStyle w:val="Header"/>
+    </w:pPr>
+  </w:p>
+</w:hdr>
 </file>
 
 <file path=word/numbering.xml><?xml version="1.0" encoding="utf-8"?>

</xml_diff>